<commit_message>
Correct the A2 prerequisite: Bowman SNLI model, not the OpenNMT checkpoint
D5.1 stated that real activations require fetching the OpenNMT en-de BiLSTM
named in nli/models/README.md. That is wrong: the checkpoint belongs to the MT
half of that codebase and the NLI path never loads it.

settings.py points at models/bowman_snli/6.pth with MODEL_TYPE = "bowman" -- a
Bowman SNLI entailment classifier produced locally by snli_train.py, matching
the checked-in preds/6_snli_1.0_dev.csv. So A2 is "train a small LSTM", not
"download a checkpoint", and it is CPU-feasible.

Also records the plumbing: analyze.py extract_features() -> per-token hidden
states, quantile_features() -> per-unit boolean mask over tokens, which is the
bitmaps array real_token_search.py currently fills with the proxy neuron.

Updates README, diary markdown, and the rendered landscape .docx.
</commit_message>
<xml_diff>
--- a/diary/summer_d5.1.docx
+++ b/diary/summer_d5.1.docx
@@ -3853,22 +3853,34 @@
         <w:t xml:space="preserve"> </w:t>
       </w:r>
       <w:r>
-        <w:t xml:space="preserve">neurons. Real activations need the OpenNMT en-de BiLSTM checkpoint named in</w:t>
-      </w:r>
-      <w:r>
-        <w:t xml:space="preserve"> </w:t>
-      </w:r>
-      <w:r>
-        <w:rPr>
-          <w:rStyle w:val="VerbatimChar"/>
-        </w:rPr>
-        <w:t xml:space="preserve">nli/models/README.md</w:t>
-      </w:r>
-      <w:r>
-        <w:t xml:space="preserve"> </w:t>
-      </w:r>
-      <w:r>
-        <w:t xml:space="preserve">— an external download, not yet fetched.</w:t>
+        <w:t xml:space="preserve">neurons. Real activations need a trained SNLI model — see §9(A2);</w:t>
+      </w:r>
+      <w:r>
+        <w:t xml:space="preserve"> </w:t>
+      </w:r>
+      <w:r>
+        <w:rPr>
+          <w:b/>
+          <w:bCs/>
+        </w:rPr>
+        <w:t xml:space="preserve">no external download is</w:t>
+      </w:r>
+      <w:r>
+        <w:rPr>
+          <w:b/>
+          <w:bCs/>
+        </w:rPr>
+        <w:t xml:space="preserve"> </w:t>
+      </w:r>
+      <w:r>
+        <w:rPr>
+          <w:b/>
+          <w:bCs/>
+        </w:rPr>
+        <w:t xml:space="preserve">involved</w:t>
+      </w:r>
+      <w:r>
+        <w:t xml:space="preserve">, contrary to an earlier draft of this entry.</w:t>
       </w:r>
     </w:p>
     <w:p>
@@ -3930,13 +3942,13 @@
         <w:t xml:space="preserve"> </w:t>
       </w:r>
       <w:r>
-        <w:t xml:space="preserve">Fetch the encoder checkpoint, dump unit activations over the same</w:t>
-      </w:r>
-      <w:r>
-        <w:t xml:space="preserve"> </w:t>
-      </w:r>
-      <w:r>
-        <w:t xml:space="preserve">token axis, and replace the proxy neuron. This upgrades the claim from</w:t>
+        <w:t xml:space="preserve">Replace the proxy neuron with real unit activations over the same</w:t>
+      </w:r>
+      <w:r>
+        <w:t xml:space="preserve"> </w:t>
+      </w:r>
+      <w:r>
+        <w:t xml:space="preserve">token axis. This upgrades the claim from</w:t>
       </w:r>
       <w:r>
         <w:t xml:space="preserve"> </w:t>
@@ -3971,6 +3983,291 @@
       </w:r>
       <w:r>
         <w:t xml:space="preserve">“real neurons in a trained model do.”</w:t>
+      </w:r>
+      <w:r>
+        <w:t xml:space="preserve"> </w:t>
+      </w:r>
+      <w:r>
+        <w:rPr>
+          <w:b/>
+          <w:bCs/>
+        </w:rPr>
+        <w:t xml:space="preserve">Cheaper than first assessed.</w:t>
+      </w:r>
+      <w:r>
+        <w:t xml:space="preserve"> </w:t>
+      </w:r>
+      <w:r>
+        <w:t xml:space="preserve">An earlier draft</w:t>
+      </w:r>
+      <w:r>
+        <w:t xml:space="preserve"> </w:t>
+      </w:r>
+      <w:r>
+        <w:t xml:space="preserve">said this required fetching the OpenNMT en-de BiLSTM from</w:t>
+      </w:r>
+      <w:r>
+        <w:t xml:space="preserve"> </w:t>
+      </w:r>
+      <w:r>
+        <w:rPr>
+          <w:rStyle w:val="VerbatimChar"/>
+        </w:rPr>
+        <w:t xml:space="preserve">nli/models/README.md</w:t>
+      </w:r>
+      <w:r>
+        <w:t xml:space="preserve">; that</w:t>
+      </w:r>
+      <w:r>
+        <w:t xml:space="preserve"> </w:t>
+      </w:r>
+      <w:r>
+        <w:t xml:space="preserve">checkpoint belongs to the</w:t>
+      </w:r>
+      <w:r>
+        <w:t xml:space="preserve"> </w:t>
+      </w:r>
+      <w:r>
+        <w:rPr>
+          <w:b/>
+          <w:bCs/>
+        </w:rPr>
+        <w:t xml:space="preserve">MT</w:t>
+      </w:r>
+      <w:r>
+        <w:t xml:space="preserve"> </w:t>
+      </w:r>
+      <w:r>
+        <w:t xml:space="preserve">half of that codebase and the NLI path never touches it.</w:t>
+      </w:r>
+      <w:r>
+        <w:t xml:space="preserve"> </w:t>
+      </w:r>
+      <w:r>
+        <w:rPr>
+          <w:rStyle w:val="VerbatimChar"/>
+        </w:rPr>
+        <w:t xml:space="preserve">settings.py</w:t>
+      </w:r>
+      <w:r>
+        <w:t xml:space="preserve"> </w:t>
+      </w:r>
+      <w:r>
+        <w:t xml:space="preserve">points at</w:t>
+      </w:r>
+      <w:r>
+        <w:t xml:space="preserve"> </w:t>
+      </w:r>
+      <w:r>
+        <w:rPr>
+          <w:rStyle w:val="VerbatimChar"/>
+        </w:rPr>
+        <w:t xml:space="preserve">models/bowman_snli/6.pth</w:t>
+      </w:r>
+      <w:r>
+        <w:t xml:space="preserve"> </w:t>
+      </w:r>
+      <w:r>
+        <w:t xml:space="preserve">with</w:t>
+      </w:r>
+      <w:r>
+        <w:t xml:space="preserve"> </w:t>
+      </w:r>
+      <w:r>
+        <w:rPr>
+          <w:rStyle w:val="VerbatimChar"/>
+        </w:rPr>
+        <w:t xml:space="preserve">MODEL_TYPE = "bowman"</w:t>
+      </w:r>
+      <w:r>
+        <w:t xml:space="preserve"> </w:t>
+      </w:r>
+      <w:r>
+        <w:t xml:space="preserve">— a Bowman</w:t>
+      </w:r>
+      <w:r>
+        <w:t xml:space="preserve"> </w:t>
+      </w:r>
+      <w:r>
+        <w:t xml:space="preserve">SNLI entailment classifier (</w:t>
+      </w:r>
+      <w:r>
+        <w:rPr>
+          <w:rStyle w:val="VerbatimChar"/>
+        </w:rPr>
+        <w:t xml:space="preserve">BowmanEntailmentClassifier</w:t>
+      </w:r>
+      <w:r>
+        <w:t xml:space="preserve">,</w:t>
+      </w:r>
+      <w:r>
+        <w:t xml:space="preserve"> </w:t>
+      </w:r>
+      <w:r>
+        <w:rPr>
+          <w:rStyle w:val="VerbatimChar"/>
+        </w:rPr>
+        <w:t xml:space="preserve">models.py</w:t>
+      </w:r>
+      <w:r>
+        <w:t xml:space="preserve">) produced locally by</w:t>
+      </w:r>
+      <w:r>
+        <w:t xml:space="preserve"> </w:t>
+      </w:r>
+      <w:r>
+        <w:rPr>
+          <w:rStyle w:val="VerbatimChar"/>
+        </w:rPr>
+        <w:t xml:space="preserve">snli_train.py</w:t>
+      </w:r>
+      <w:r>
+        <w:t xml:space="preserve">, which writes</w:t>
+      </w:r>
+      <w:r>
+        <w:t xml:space="preserve"> </w:t>
+      </w:r>
+      <w:r>
+        <w:rPr>
+          <w:rStyle w:val="VerbatimChar"/>
+        </w:rPr>
+        <w:t xml:space="preserve">{epoch}.pth</w:t>
+      </w:r>
+      <w:r>
+        <w:t xml:space="preserve">; the checked-in</w:t>
+      </w:r>
+      <w:r>
+        <w:t xml:space="preserve"> </w:t>
+      </w:r>
+      <w:r>
+        <w:rPr>
+          <w:rStyle w:val="VerbatimChar"/>
+        </w:rPr>
+        <w:t xml:space="preserve">preds/6_snli_1.0_dev.csv</w:t>
+      </w:r>
+      <w:r>
+        <w:t xml:space="preserve"> </w:t>
+      </w:r>
+      <w:r>
+        <w:t xml:space="preserve">is</w:t>
+      </w:r>
+      <w:r>
+        <w:t xml:space="preserve"> </w:t>
+      </w:r>
+      <w:r>
+        <w:t xml:space="preserve">that epoch-6 model’s output. So the step is</w:t>
+      </w:r>
+      <w:r>
+        <w:t xml:space="preserve"> </w:t>
+      </w:r>
+      <w:r>
+        <w:rPr>
+          <w:b/>
+          <w:bCs/>
+        </w:rPr>
+        <w:t xml:space="preserve">train a small LSTM, not download anything</w:t>
+      </w:r>
+      <w:r>
+        <w:t xml:space="preserve">,</w:t>
+      </w:r>
+      <w:r>
+        <w:t xml:space="preserve"> </w:t>
+      </w:r>
+      <w:r>
+        <w:t xml:space="preserve">and it is CPU-feasible. The plumbing already lines up:</w:t>
+      </w:r>
+      <w:r>
+        <w:t xml:space="preserve"> </w:t>
+      </w:r>
+      <w:r>
+        <w:rPr>
+          <w:rStyle w:val="VerbatimChar"/>
+        </w:rPr>
+        <w:t xml:space="preserve">analyze.py:extract_features()</w:t>
+      </w:r>
+      <w:r>
+        <w:t xml:space="preserve"> </w:t>
+      </w:r>
+      <w:r>
+        <w:t xml:space="preserve">collects per-token hidden states</w:t>
+      </w:r>
+      <w:r>
+        <w:t xml:space="preserve"> </w:t>
+      </w:r>
+      <w:r>
+        <w:rPr>
+          <w:rStyle w:val="VerbatimChar"/>
+        </w:rPr>
+        <w:t xml:space="preserve">(n_tokens, n_units)</w:t>
+      </w:r>
+      <w:r>
+        <w:t xml:space="preserve"> </w:t>
+      </w:r>
+      <w:r>
+        <w:t xml:space="preserve">and</w:t>
+      </w:r>
+      <w:r>
+        <w:t xml:space="preserve"> </w:t>
+      </w:r>
+      <w:r>
+        <w:rPr>
+          <w:rStyle w:val="VerbatimChar"/>
+        </w:rPr>
+        <w:t xml:space="preserve">quantile_features()</w:t>
+      </w:r>
+      <w:r>
+        <w:t xml:space="preserve"> </w:t>
+      </w:r>
+      <w:r>
+        <w:t xml:space="preserve">thresholds</w:t>
+      </w:r>
+      <w:r>
+        <w:t xml:space="preserve"> </w:t>
+      </w:r>
+      <w:r>
+        <w:t xml:space="preserve">each unit into a boolean mask over tokens — precisely the</w:t>
+      </w:r>
+      <w:r>
+        <w:t xml:space="preserve"> </w:t>
+      </w:r>
+      <w:r>
+        <w:rPr>
+          <w:rStyle w:val="VerbatimChar"/>
+        </w:rPr>
+        <w:t xml:space="preserve">bitmaps</w:t>
+      </w:r>
+      <w:r>
+        <w:t xml:space="preserve"> </w:t>
+      </w:r>
+      <w:r>
+        <w:t xml:space="preserve">array</w:t>
+      </w:r>
+      <w:r>
+        <w:t xml:space="preserve"> </w:t>
+      </w:r>
+      <w:r>
+        <w:rPr>
+          <w:rStyle w:val="VerbatimChar"/>
+        </w:rPr>
+        <w:t xml:space="preserve">real_token_search.py</w:t>
+      </w:r>
+      <w:r>
+        <w:t xml:space="preserve"> </w:t>
+      </w:r>
+      <w:r>
+        <w:t xml:space="preserve">currently fills with the proxy, so the swap is one array plus a</w:t>
+      </w:r>
+      <w:r>
+        <w:t xml:space="preserve"> </w:t>
+      </w:r>
+      <w:r>
+        <w:t xml:space="preserve">training run. Our own task7 Bowman LSTM (0.775 dev) is the same architecture family and is</w:t>
+      </w:r>
+      <w:r>
+        <w:t xml:space="preserve"> </w:t>
+      </w:r>
+      <w:r>
+        <w:t xml:space="preserve">an alternative source of units.</w:t>
       </w:r>
     </w:p>
     <w:p>

</xml_diff>